<commit_message>
High-frequency (2.5-m grid) runs and correlation-length break test
Add the 2.5-m-grid simulation setup (sensor B, 50/100 Hz), the exponential
correlation-length series a = 5-134 m and the Qc^-1 curvature / 100-Hz coda
level test (s17_break_test.m, Table 5, Fig. 17). The curvature is not
diagnostic, but the 100-Hz coda level rejects large-scale Gaussian and smooth
crusts. Remove all in-figure titles in favour of panel letters (panel_label.m)
with per-panel captions; cite Igel, Mora & Riollet (1995) and Igel (2016).

Co-Authored-By: Claude Opus 5.5 <noreply@anthropic.com>
</commit_message>
<xml_diff>
--- a/manuscript/Paper2_manuscript.docx
+++ b/manuscript/Paper2_manuscript.docx
@@ -299,7 +299,22 @@
           <w:b w:val="0"/>
           <w:i w:val="0"/>
         </w:rPr>
-        <w:t xml:space="preserve"> (sensor B), with no characteristic frequency. Its 25–50 Hz slope (-1.46) is reproduced by pink and exponential media (-1.68 to -1.29 and -1.81 to -1.35), but not by smooth crusts (-0.87 to -0.83) and only rarely by Gaussian media with </w:t>
+        <w:t xml:space="preserve"> (sensor B). Simulations with correlation lengths of 5–134 m show, however, that such a power law is not diagnostic of scale-free heterogeneity. A 2.5-m-grid simulation series extended to 100 Hz is more selective. At 100 Hz the observed coda level (-1.58 in log</w:t>
+      </w:r>
+      <w:r>
+        <w:rPr>
+          <w:b w:val="0"/>
+          <w:i w:val="0"/>
+          <w:vertAlign w:val="subscript"/>
+        </w:rPr>
+        <w:t>10</w:t>
+      </w:r>
+      <w:r>
+        <w:rPr>
+          <w:b w:val="0"/>
+          <w:i w:val="0"/>
+        </w:rPr>
+        <w:t xml:space="preserve"> of coda/S energy) is close to that of pink media (-1.50 to -1.20) and is bracketed by exponential media (-1.82 to -1.03, decreasing with </w:t>
       </w:r>
       <w:r>
         <w:rPr>
@@ -313,7 +328,21 @@
           <w:b w:val="0"/>
           <w:i w:val="0"/>
         </w:rPr>
-        <w:t xml:space="preserve"> = 50 m. The MEQ wavefields thus reject the smooth crustal models of routine microseismic practice and require a strongly scattering crust. The power-law (pink) character of that crust is supported by the borehole data, not independently by the seismic wavefield.</w:t>
+        <w:t xml:space="preserve">), whereas the Gaussian medium with </w:t>
+      </w:r>
+      <w:r>
+        <w:rPr>
+          <w:b w:val="0"/>
+          <w:i/>
+        </w:rPr>
+        <w:t>a</w:t>
+      </w:r>
+      <w:r>
+        <w:rPr>
+          <w:b w:val="0"/>
+          <w:i w:val="0"/>
+        </w:rPr>
+        <w:t xml:space="preserve"> = 50 m (-3.01 to -2.20) and the homogeneous crust (-3.17) lose their coda. The MEQ wavefields thus reject the smooth crustal models of routine microseismic practice and require a strongly scattering crust. The power-law (pink) character of that crust is supported by the borehole data, not independently by the seismic wavefield.</w:t>
       </w:r>
     </w:p>
     <w:p>
@@ -3630,7 +3659,134 @@
           <w:b w:val="0"/>
           <w:i w:val="0"/>
         </w:rPr>
-        <w:t xml:space="preserve"> ≈ 3.4 km/s), whereas a scale-free medium should not. The same measures are computed on the FD synthetics in the 25 and 50 Hz bands, which the 5-m grid resolves.</w:t>
+        <w:t xml:space="preserve"> ≈ 3.4 km/s), whereas a scale-free medium should not. The same measures are computed on the FD synthetics in the 25 and 50 Hz bands, which the 5-m grid resolves (sensors A and B).</w:t>
+      </w:r>
+    </w:p>
+    <w:p>
+      <w:pPr>
+        <w:pStyle w:val="Heading2"/>
+      </w:pPr>
+      <w:r>
+        <w:t>High-frequency simulations and correlation-length series</w:t>
+      </w:r>
+    </w:p>
+    <w:p>
+      <w:pPr>
+        <w:jc w:val="both"/>
+      </w:pPr>
+      <w:r>
+        <w:rPr>
+          <w:b w:val="0"/>
+          <w:i w:val="0"/>
+        </w:rPr>
+        <w:t>To reach 100 Hz the FD grid is refined to 2.5 m (169×209×153 nodes, Δ</w:t>
+      </w:r>
+      <w:r>
+        <w:rPr>
+          <w:b w:val="0"/>
+          <w:i/>
+        </w:rPr>
+        <w:t>t</w:t>
+      </w:r>
+      <w:r>
+        <w:rPr>
+          <w:b w:val="0"/>
+          <w:i w:val="0"/>
+        </w:rPr>
+        <w:t xml:space="preserve"> = 0.125 ms, 2200 steps, Ricker 90 Hz; at least 5.7 grid points per minimum S wavelength at 160 Hz). To keep the cost manageable the volume is reduced to sensor B and the core of the event cloud, which retains 542 events at 92–392 m. The records are decimated to the 4-kHz data sampling. This grid is run for the homogeneous crust, pink σ = 0.13 (two realisations), exponential </w:t>
+      </w:r>
+      <w:r>
+        <w:rPr>
+          <w:b w:val="0"/>
+          <w:i/>
+        </w:rPr>
+        <w:t>a</w:t>
+      </w:r>
+      <w:r>
+        <w:rPr>
+          <w:b w:val="0"/>
+          <w:i w:val="0"/>
+        </w:rPr>
+        <w:t xml:space="preserve"> = 15 m (two), Gaussian </w:t>
+      </w:r>
+      <w:r>
+        <w:rPr>
+          <w:b w:val="0"/>
+          <w:i/>
+        </w:rPr>
+        <w:t>a</w:t>
+      </w:r>
+      <w:r>
+        <w:rPr>
+          <w:b w:val="0"/>
+          <w:i w:val="0"/>
+        </w:rPr>
+        <w:t xml:space="preserve"> = 50 m (two) and an exponential correlation-length series with </w:t>
+      </w:r>
+      <w:r>
+        <w:rPr>
+          <w:b w:val="0"/>
+          <w:i/>
+        </w:rPr>
+        <w:t>a</w:t>
+      </w:r>
+      <w:r>
+        <w:rPr>
+          <w:b w:val="0"/>
+          <w:i w:val="0"/>
+        </w:rPr>
+        <w:t xml:space="preserve"> = 5, 9, 17, 34, 67 and 134 m (σ = 0.13). The series </w:t>
+      </w:r>
+      <w:r>
+        <w:rPr>
+          <w:b w:val="0"/>
+          <w:i/>
+        </w:rPr>
+        <w:t>a</w:t>
+      </w:r>
+      <w:r>
+        <w:rPr>
+          <w:b w:val="0"/>
+          <w:i w:val="0"/>
+        </w:rPr>
+        <w:t xml:space="preserve"> = 9–134 m is also run on the 5-m grid. Together the two grids give Q</w:t>
+      </w:r>
+      <w:r>
+        <w:rPr>
+          <w:b w:val="0"/>
+          <w:i w:val="0"/>
+          <w:vertAlign w:val="subscript"/>
+        </w:rPr>
+        <w:t>c</w:t>
+      </w:r>
+      <w:r>
+        <w:rPr>
+          <w:b w:val="0"/>
+          <w:i w:val="0"/>
+          <w:vertAlign w:val="superscript"/>
+        </w:rPr>
+        <w:t>-1</w:t>
+      </w:r>
+      <w:r>
+        <w:rPr>
+          <w:b w:val="0"/>
+          <w:i w:val="0"/>
+        </w:rPr>
+        <w:t xml:space="preserve"> and coda level at 25 and 50 Hz (sensor A, 5-m grid) and at 50 and 100 Hz (sensor B, 2.5-m grid). The curvature, slope(50–100 Hz) − slope(25–50 Hz), measures a change of slope of the kind expected near </w:t>
+      </w:r>
+      <w:r>
+        <w:rPr>
+          <w:b w:val="0"/>
+          <w:i/>
+        </w:rPr>
+        <w:t>ka</w:t>
+      </w:r>
+      <w:r>
+        <w:rPr>
+          <w:b w:val="0"/>
+          <w:i w:val="0"/>
+        </w:rPr>
+        <w:t xml:space="preserve"> ≈ 1. Synthetic records on the 2.5-m grid are noise-free.</w:t>
       </w:r>
     </w:p>
     <w:p>
@@ -7827,7 +7983,7 @@
           <w:b w:val="0"/>
           <w:i w:val="0"/>
         </w:rPr>
-        <w:t xml:space="preserve"> shows no characteristic frequency over S wavelengths of about 17–134 m. This is what a scale-free medium predicts. For a medium with a correlation length </w:t>
+        <w:t xml:space="preserve"> shows no characteristic frequency over S wavelengths of about 17–134 m. For a medium with a correlation length </w:t>
       </w:r>
       <w:r>
         <w:rPr>
@@ -7841,7 +7997,7 @@
           <w:b w:val="0"/>
           <w:i w:val="0"/>
         </w:rPr>
-        <w:t xml:space="preserve">, the change of behaviour is expected near </w:t>
+        <w:t xml:space="preserve">, a change of behaviour would be expected near </w:t>
       </w:r>
       <w:r>
         <w:rPr>
@@ -7855,7 +8011,7 @@
           <w:b w:val="0"/>
           <w:i w:val="0"/>
         </w:rPr>
-        <w:t xml:space="preserve"> ≈ 1, which for 25–200 Hz corresponds to </w:t>
+        <w:t xml:space="preserve"> ≈ 1. For 25–200 Hz this corresponds to </w:t>
       </w:r>
       <w:r>
         <w:rPr>
@@ -7869,7 +8025,7 @@
           <w:b w:val="0"/>
           <w:i w:val="0"/>
         </w:rPr>
-        <w:t xml:space="preserve"> ≈ 3–21 m rather than to the wavelengths themselves. [SIMULATION TEST WITH EXPONENTIAL MEDIA, a = 5–134 m, IN PROGRESS] The coda level, by contrast, flattens above 50–100 Hz (ΔBIC = -65 and -44). This may reflect the growing influence of the resonances toward 200 Hz, and we do not use it for inference.</w:t>
+        <w:t xml:space="preserve"> ≈ 3–21 m, not to the wavelengths themselves. Whether this test can detect a correlation length is examined with simulations below (Table 5); it turns out that it cannot. The coda level, by contrast, flattens above 50–100 Hz (ΔBIC = -65 and -44). This may reflect the growing influence of the resonances toward 200 Hz, and we do not use it for inference.</w:t>
       </w:r>
     </w:p>
     <w:p>
@@ -8209,6 +8365,1836 @@
     </w:p>
     <w:p>
       <w:pPr>
+        <w:pStyle w:val="Heading2"/>
+      </w:pPr>
+      <w:r>
+        <w:t>Coda at 100 Hz and the correlation-length series</w:t>
+      </w:r>
+    </w:p>
+    <w:p>
+      <w:pPr>
+        <w:keepNext/>
+      </w:pPr>
+      <w:r>
+        <w:rPr>
+          <w:b/>
+        </w:rPr>
+        <w:t xml:space="preserve">Table 5 </w:t>
+      </w:r>
+      <w:r>
+        <w:rPr>
+          <w:b/>
+          <w:i w:val="0"/>
+        </w:rPr>
+        <w:t>Q</w:t>
+      </w:r>
+      <w:r>
+        <w:rPr>
+          <w:b/>
+          <w:i w:val="0"/>
+          <w:vertAlign w:val="subscript"/>
+        </w:rPr>
+        <w:t>c</w:t>
+      </w:r>
+      <w:r>
+        <w:rPr>
+          <w:b/>
+          <w:i w:val="0"/>
+          <w:vertAlign w:val="superscript"/>
+        </w:rPr>
+        <w:t>-1</w:t>
+      </w:r>
+      <w:r>
+        <w:rPr>
+          <w:b/>
+          <w:i w:val="0"/>
+        </w:rPr>
+        <w:t xml:space="preserve"> slopes, their curvature and the 100-Hz coda level</w:t>
+      </w:r>
+    </w:p>
+    <w:tbl>
+      <w:tblPr>
+        <w:tblW w:type="auto" w:w="0"/>
+        <w:jc w:val="center"/>
+        <w:tblLayout w:type="fixed"/>
+        <w:tblLook w:firstColumn="1" w:firstRow="1" w:lastColumn="0" w:lastRow="0" w:noHBand="0" w:noVBand="1" w:val="04A0"/>
+        <w:tblBorders>
+          <w:top w:val="single" w:sz="8" w:color="000000"/>
+          <w:bottom w:val="single" w:sz="8" w:color="000000"/>
+          <w:insideH w:val="single" w:sz="4" w:color="000000"/>
+          <w:left w:val="nil"/>
+          <w:right w:val="nil"/>
+          <w:insideV w:val="nil"/>
+        </w:tblBorders>
+      </w:tblPr>
+      <w:tblGrid>
+        <w:gridCol w:w="1814"/>
+        <w:gridCol w:w="1814"/>
+        <w:gridCol w:w="1814"/>
+        <w:gridCol w:w="1814"/>
+        <w:gridCol w:w="1814"/>
+      </w:tblGrid>
+      <w:tr>
+        <w:tc>
+          <w:tcPr>
+            <w:tcW w:type="dxa" w:w="2948"/>
+          </w:tcPr>
+          <w:p>
+            <w:pPr>
+              <w:spacing w:line="240" w:lineRule="auto"/>
+            </w:pPr>
+            <w:r>
+              <w:rPr>
+                <w:b/>
+                <w:i w:val="0"/>
+                <w:sz w:val="20"/>
+              </w:rPr>
+              <w:t>Medium (σ = 0.13)</w:t>
+            </w:r>
+          </w:p>
+        </w:tc>
+        <w:tc>
+          <w:tcPr>
+            <w:tcW w:type="dxa" w:w="1701"/>
+          </w:tcPr>
+          <w:p>
+            <w:pPr>
+              <w:spacing w:line="240" w:lineRule="auto"/>
+            </w:pPr>
+            <w:r>
+              <w:rPr>
+                <w:b/>
+                <w:i w:val="0"/>
+                <w:sz w:val="20"/>
+              </w:rPr>
+              <w:t>Slope 25–50 Hz (A)</w:t>
+            </w:r>
+          </w:p>
+        </w:tc>
+        <w:tc>
+          <w:tcPr>
+            <w:tcW w:type="dxa" w:w="1701"/>
+          </w:tcPr>
+          <w:p>
+            <w:pPr>
+              <w:spacing w:line="240" w:lineRule="auto"/>
+            </w:pPr>
+            <w:r>
+              <w:rPr>
+                <w:b/>
+                <w:i w:val="0"/>
+                <w:sz w:val="20"/>
+              </w:rPr>
+              <w:t>Slope 50–100 Hz (B)</w:t>
+            </w:r>
+          </w:p>
+        </w:tc>
+        <w:tc>
+          <w:tcPr>
+            <w:tcW w:type="dxa" w:w="1701"/>
+          </w:tcPr>
+          <w:p>
+            <w:pPr>
+              <w:spacing w:line="240" w:lineRule="auto"/>
+            </w:pPr>
+            <w:r>
+              <w:rPr>
+                <w:b/>
+                <w:i w:val="0"/>
+                <w:sz w:val="20"/>
+              </w:rPr>
+              <w:t>Curvature</w:t>
+            </w:r>
+          </w:p>
+        </w:tc>
+        <w:tc>
+          <w:tcPr>
+            <w:tcW w:type="dxa" w:w="1474"/>
+          </w:tcPr>
+          <w:p>
+            <w:pPr>
+              <w:spacing w:line="240" w:lineRule="auto"/>
+            </w:pPr>
+            <w:r>
+              <w:rPr>
+                <w:b/>
+                <w:i w:val="0"/>
+                <w:sz w:val="20"/>
+              </w:rPr>
+              <w:t>Coda level 100 Hz (B)</w:t>
+            </w:r>
+          </w:p>
+        </w:tc>
+      </w:tr>
+      <w:tr>
+        <w:tc>
+          <w:tcPr>
+            <w:tcW w:type="dxa" w:w="2948"/>
+          </w:tcPr>
+          <w:p>
+            <w:pPr>
+              <w:spacing w:line="240" w:lineRule="auto"/>
+            </w:pPr>
+            <w:r>
+              <w:rPr>
+                <w:b w:val="0"/>
+                <w:i w:val="0"/>
+                <w:sz w:val="20"/>
+              </w:rPr>
+              <w:t>homogeneous</w:t>
+            </w:r>
+          </w:p>
+        </w:tc>
+        <w:tc>
+          <w:tcPr>
+            <w:tcW w:type="dxa" w:w="1701"/>
+          </w:tcPr>
+          <w:p>
+            <w:pPr>
+              <w:spacing w:line="240" w:lineRule="auto"/>
+            </w:pPr>
+            <w:r>
+              <w:rPr>
+                <w:b w:val="0"/>
+                <w:i w:val="0"/>
+                <w:sz w:val="20"/>
+              </w:rPr>
+              <w:t>-0.83</w:t>
+            </w:r>
+          </w:p>
+        </w:tc>
+        <w:tc>
+          <w:tcPr>
+            <w:tcW w:type="dxa" w:w="1701"/>
+          </w:tcPr>
+          <w:p>
+            <w:pPr>
+              <w:spacing w:line="240" w:lineRule="auto"/>
+            </w:pPr>
+            <w:r>
+              <w:rPr>
+                <w:b w:val="0"/>
+                <w:i w:val="0"/>
+                <w:sz w:val="20"/>
+              </w:rPr>
+              <w:t>-0.34</w:t>
+            </w:r>
+          </w:p>
+        </w:tc>
+        <w:tc>
+          <w:tcPr>
+            <w:tcW w:type="dxa" w:w="1701"/>
+          </w:tcPr>
+          <w:p>
+            <w:pPr>
+              <w:spacing w:line="240" w:lineRule="auto"/>
+            </w:pPr>
+            <w:r>
+              <w:rPr>
+                <w:b w:val="0"/>
+                <w:i w:val="0"/>
+                <w:sz w:val="20"/>
+              </w:rPr>
+              <w:t>+0.49</w:t>
+            </w:r>
+          </w:p>
+        </w:tc>
+        <w:tc>
+          <w:tcPr>
+            <w:tcW w:type="dxa" w:w="1474"/>
+          </w:tcPr>
+          <w:p>
+            <w:pPr>
+              <w:spacing w:line="240" w:lineRule="auto"/>
+            </w:pPr>
+            <w:r>
+              <w:rPr>
+                <w:b w:val="0"/>
+                <w:i w:val="0"/>
+                <w:sz w:val="20"/>
+              </w:rPr>
+              <w:t>-3.17</w:t>
+            </w:r>
+          </w:p>
+        </w:tc>
+      </w:tr>
+      <w:tr>
+        <w:tc>
+          <w:tcPr>
+            <w:tcW w:type="dxa" w:w="2948"/>
+          </w:tcPr>
+          <w:p>
+            <w:pPr>
+              <w:spacing w:line="240" w:lineRule="auto"/>
+            </w:pPr>
+            <w:r>
+              <w:rPr>
+                <w:b w:val="0"/>
+                <w:i w:val="0"/>
+                <w:sz w:val="20"/>
+              </w:rPr>
+              <w:t>pink (seed 11)</w:t>
+            </w:r>
+          </w:p>
+        </w:tc>
+        <w:tc>
+          <w:tcPr>
+            <w:tcW w:type="dxa" w:w="1701"/>
+          </w:tcPr>
+          <w:p>
+            <w:pPr>
+              <w:spacing w:line="240" w:lineRule="auto"/>
+            </w:pPr>
+            <w:r>
+              <w:rPr>
+                <w:b w:val="0"/>
+                <w:i w:val="0"/>
+                <w:sz w:val="20"/>
+              </w:rPr>
+              <w:t>-1.43</w:t>
+            </w:r>
+          </w:p>
+        </w:tc>
+        <w:tc>
+          <w:tcPr>
+            <w:tcW w:type="dxa" w:w="1701"/>
+          </w:tcPr>
+          <w:p>
+            <w:pPr>
+              <w:spacing w:line="240" w:lineRule="auto"/>
+            </w:pPr>
+            <w:r>
+              <w:rPr>
+                <w:b w:val="0"/>
+                <w:i w:val="0"/>
+                <w:sz w:val="20"/>
+              </w:rPr>
+              <w:t>-1.18</w:t>
+            </w:r>
+          </w:p>
+        </w:tc>
+        <w:tc>
+          <w:tcPr>
+            <w:tcW w:type="dxa" w:w="1701"/>
+          </w:tcPr>
+          <w:p>
+            <w:pPr>
+              <w:spacing w:line="240" w:lineRule="auto"/>
+            </w:pPr>
+            <w:r>
+              <w:rPr>
+                <w:b w:val="0"/>
+                <w:i w:val="0"/>
+                <w:sz w:val="20"/>
+              </w:rPr>
+              <w:t>+0.24</w:t>
+            </w:r>
+          </w:p>
+        </w:tc>
+        <w:tc>
+          <w:tcPr>
+            <w:tcW w:type="dxa" w:w="1474"/>
+          </w:tcPr>
+          <w:p>
+            <w:pPr>
+              <w:spacing w:line="240" w:lineRule="auto"/>
+            </w:pPr>
+            <w:r>
+              <w:rPr>
+                <w:b w:val="0"/>
+                <w:i w:val="0"/>
+                <w:sz w:val="20"/>
+              </w:rPr>
+              <w:t>-1.20</w:t>
+            </w:r>
+          </w:p>
+        </w:tc>
+      </w:tr>
+      <w:tr>
+        <w:tc>
+          <w:tcPr>
+            <w:tcW w:type="dxa" w:w="2948"/>
+          </w:tcPr>
+          <w:p>
+            <w:pPr>
+              <w:spacing w:line="240" w:lineRule="auto"/>
+            </w:pPr>
+            <w:r>
+              <w:rPr>
+                <w:b w:val="0"/>
+                <w:i w:val="0"/>
+                <w:sz w:val="20"/>
+              </w:rPr>
+              <w:t>pink (seed 33)</w:t>
+            </w:r>
+          </w:p>
+        </w:tc>
+        <w:tc>
+          <w:tcPr>
+            <w:tcW w:type="dxa" w:w="1701"/>
+          </w:tcPr>
+          <w:p>
+            <w:pPr>
+              <w:spacing w:line="240" w:lineRule="auto"/>
+            </w:pPr>
+            <w:r>
+              <w:rPr>
+                <w:b w:val="0"/>
+                <w:i w:val="0"/>
+                <w:sz w:val="20"/>
+              </w:rPr>
+              <w:t>-1.37</w:t>
+            </w:r>
+          </w:p>
+        </w:tc>
+        <w:tc>
+          <w:tcPr>
+            <w:tcW w:type="dxa" w:w="1701"/>
+          </w:tcPr>
+          <w:p>
+            <w:pPr>
+              <w:spacing w:line="240" w:lineRule="auto"/>
+            </w:pPr>
+            <w:r>
+              <w:rPr>
+                <w:b w:val="0"/>
+                <w:i w:val="0"/>
+                <w:sz w:val="20"/>
+              </w:rPr>
+              <w:t>-1.20</w:t>
+            </w:r>
+          </w:p>
+        </w:tc>
+        <w:tc>
+          <w:tcPr>
+            <w:tcW w:type="dxa" w:w="1701"/>
+          </w:tcPr>
+          <w:p>
+            <w:pPr>
+              <w:spacing w:line="240" w:lineRule="auto"/>
+            </w:pPr>
+            <w:r>
+              <w:rPr>
+                <w:b w:val="0"/>
+                <w:i w:val="0"/>
+                <w:sz w:val="20"/>
+              </w:rPr>
+              <w:t>+0.16</w:t>
+            </w:r>
+          </w:p>
+        </w:tc>
+        <w:tc>
+          <w:tcPr>
+            <w:tcW w:type="dxa" w:w="1474"/>
+          </w:tcPr>
+          <w:p>
+            <w:pPr>
+              <w:spacing w:line="240" w:lineRule="auto"/>
+            </w:pPr>
+            <w:r>
+              <w:rPr>
+                <w:b w:val="0"/>
+                <w:i w:val="0"/>
+                <w:sz w:val="20"/>
+              </w:rPr>
+              <w:t>-1.50</w:t>
+            </w:r>
+          </w:p>
+        </w:tc>
+      </w:tr>
+      <w:tr>
+        <w:tc>
+          <w:tcPr>
+            <w:tcW w:type="dxa" w:w="2948"/>
+          </w:tcPr>
+          <w:p>
+            <w:pPr>
+              <w:spacing w:line="240" w:lineRule="auto"/>
+            </w:pPr>
+            <w:r>
+              <w:rPr>
+                <w:b w:val="0"/>
+                <w:i w:val="0"/>
+                <w:sz w:val="20"/>
+              </w:rPr>
+              <w:t>exponential, a = 15 m</w:t>
+            </w:r>
+          </w:p>
+        </w:tc>
+        <w:tc>
+          <w:tcPr>
+            <w:tcW w:type="dxa" w:w="1701"/>
+          </w:tcPr>
+          <w:p>
+            <w:pPr>
+              <w:spacing w:line="240" w:lineRule="auto"/>
+            </w:pPr>
+            <w:r>
+              <w:rPr>
+                <w:b w:val="0"/>
+                <w:i w:val="0"/>
+                <w:sz w:val="20"/>
+              </w:rPr>
+              <w:t>-1.48</w:t>
+            </w:r>
+          </w:p>
+        </w:tc>
+        <w:tc>
+          <w:tcPr>
+            <w:tcW w:type="dxa" w:w="1701"/>
+          </w:tcPr>
+          <w:p>
+            <w:pPr>
+              <w:spacing w:line="240" w:lineRule="auto"/>
+            </w:pPr>
+            <w:r>
+              <w:rPr>
+                <w:b w:val="0"/>
+                <w:i w:val="0"/>
+                <w:sz w:val="20"/>
+              </w:rPr>
+              <w:t>-1.04</w:t>
+            </w:r>
+          </w:p>
+        </w:tc>
+        <w:tc>
+          <w:tcPr>
+            <w:tcW w:type="dxa" w:w="1701"/>
+          </w:tcPr>
+          <w:p>
+            <w:pPr>
+              <w:spacing w:line="240" w:lineRule="auto"/>
+            </w:pPr>
+            <w:r>
+              <w:rPr>
+                <w:b w:val="0"/>
+                <w:i w:val="0"/>
+                <w:sz w:val="20"/>
+              </w:rPr>
+              <w:t>+0.44</w:t>
+            </w:r>
+          </w:p>
+        </w:tc>
+        <w:tc>
+          <w:tcPr>
+            <w:tcW w:type="dxa" w:w="1474"/>
+          </w:tcPr>
+          <w:p>
+            <w:pPr>
+              <w:spacing w:line="240" w:lineRule="auto"/>
+            </w:pPr>
+            <w:r>
+              <w:rPr>
+                <w:b w:val="0"/>
+                <w:i w:val="0"/>
+                <w:sz w:val="20"/>
+              </w:rPr>
+              <w:t>-1.09</w:t>
+            </w:r>
+          </w:p>
+        </w:tc>
+      </w:tr>
+      <w:tr>
+        <w:tc>
+          <w:tcPr>
+            <w:tcW w:type="dxa" w:w="2948"/>
+          </w:tcPr>
+          <w:p>
+            <w:pPr>
+              <w:spacing w:line="240" w:lineRule="auto"/>
+            </w:pPr>
+            <w:r>
+              <w:rPr>
+                <w:b w:val="0"/>
+                <w:i w:val="0"/>
+                <w:sz w:val="20"/>
+              </w:rPr>
+              <w:t>exponential, a = 15 m (seed 33)</w:t>
+            </w:r>
+          </w:p>
+        </w:tc>
+        <w:tc>
+          <w:tcPr>
+            <w:tcW w:type="dxa" w:w="1701"/>
+          </w:tcPr>
+          <w:p>
+            <w:pPr>
+              <w:spacing w:line="240" w:lineRule="auto"/>
+            </w:pPr>
+            <w:r>
+              <w:rPr>
+                <w:b w:val="0"/>
+                <w:i w:val="0"/>
+                <w:sz w:val="20"/>
+              </w:rPr>
+              <w:t>-1.45</w:t>
+            </w:r>
+          </w:p>
+        </w:tc>
+        <w:tc>
+          <w:tcPr>
+            <w:tcW w:type="dxa" w:w="1701"/>
+          </w:tcPr>
+          <w:p>
+            <w:pPr>
+              <w:spacing w:line="240" w:lineRule="auto"/>
+            </w:pPr>
+            <w:r>
+              <w:rPr>
+                <w:b w:val="0"/>
+                <w:i w:val="0"/>
+                <w:sz w:val="20"/>
+              </w:rPr>
+              <w:t>-1.17</w:t>
+            </w:r>
+          </w:p>
+        </w:tc>
+        <w:tc>
+          <w:tcPr>
+            <w:tcW w:type="dxa" w:w="1701"/>
+          </w:tcPr>
+          <w:p>
+            <w:pPr>
+              <w:spacing w:line="240" w:lineRule="auto"/>
+            </w:pPr>
+            <w:r>
+              <w:rPr>
+                <w:b w:val="0"/>
+                <w:i w:val="0"/>
+                <w:sz w:val="20"/>
+              </w:rPr>
+              <w:t>+0.28</w:t>
+            </w:r>
+          </w:p>
+        </w:tc>
+        <w:tc>
+          <w:tcPr>
+            <w:tcW w:type="dxa" w:w="1474"/>
+          </w:tcPr>
+          <w:p>
+            <w:pPr>
+              <w:spacing w:line="240" w:lineRule="auto"/>
+            </w:pPr>
+            <w:r>
+              <w:rPr>
+                <w:b w:val="0"/>
+                <w:i w:val="0"/>
+                <w:sz w:val="20"/>
+              </w:rPr>
+              <w:t>-1.52</w:t>
+            </w:r>
+          </w:p>
+        </w:tc>
+      </w:tr>
+      <w:tr>
+        <w:tc>
+          <w:tcPr>
+            <w:tcW w:type="dxa" w:w="2948"/>
+          </w:tcPr>
+          <w:p>
+            <w:pPr>
+              <w:spacing w:line="240" w:lineRule="auto"/>
+            </w:pPr>
+            <w:r>
+              <w:rPr>
+                <w:b w:val="0"/>
+                <w:i w:val="0"/>
+                <w:sz w:val="20"/>
+              </w:rPr>
+              <w:t>Gaussian, a = 50 m</w:t>
+            </w:r>
+          </w:p>
+        </w:tc>
+        <w:tc>
+          <w:tcPr>
+            <w:tcW w:type="dxa" w:w="1701"/>
+          </w:tcPr>
+          <w:p>
+            <w:pPr>
+              <w:spacing w:line="240" w:lineRule="auto"/>
+            </w:pPr>
+            <w:r>
+              <w:rPr>
+                <w:b w:val="0"/>
+                <w:i w:val="0"/>
+                <w:sz w:val="20"/>
+              </w:rPr>
+              <w:t>-1.18</w:t>
+            </w:r>
+          </w:p>
+        </w:tc>
+        <w:tc>
+          <w:tcPr>
+            <w:tcW w:type="dxa" w:w="1701"/>
+          </w:tcPr>
+          <w:p>
+            <w:pPr>
+              <w:spacing w:line="240" w:lineRule="auto"/>
+            </w:pPr>
+            <w:r>
+              <w:rPr>
+                <w:b w:val="0"/>
+                <w:i w:val="0"/>
+                <w:sz w:val="20"/>
+              </w:rPr>
+              <w:t>-0.86</w:t>
+            </w:r>
+          </w:p>
+        </w:tc>
+        <w:tc>
+          <w:tcPr>
+            <w:tcW w:type="dxa" w:w="1701"/>
+          </w:tcPr>
+          <w:p>
+            <w:pPr>
+              <w:spacing w:line="240" w:lineRule="auto"/>
+            </w:pPr>
+            <w:r>
+              <w:rPr>
+                <w:b w:val="0"/>
+                <w:i w:val="0"/>
+                <w:sz w:val="20"/>
+              </w:rPr>
+              <w:t>+0.32</w:t>
+            </w:r>
+          </w:p>
+        </w:tc>
+        <w:tc>
+          <w:tcPr>
+            <w:tcW w:type="dxa" w:w="1474"/>
+          </w:tcPr>
+          <w:p>
+            <w:pPr>
+              <w:spacing w:line="240" w:lineRule="auto"/>
+            </w:pPr>
+            <w:r>
+              <w:rPr>
+                <w:b w:val="0"/>
+                <w:i w:val="0"/>
+                <w:sz w:val="20"/>
+              </w:rPr>
+              <w:t>-2.20</w:t>
+            </w:r>
+          </w:p>
+        </w:tc>
+      </w:tr>
+      <w:tr>
+        <w:tc>
+          <w:tcPr>
+            <w:tcW w:type="dxa" w:w="2948"/>
+          </w:tcPr>
+          <w:p>
+            <w:pPr>
+              <w:spacing w:line="240" w:lineRule="auto"/>
+            </w:pPr>
+            <w:r>
+              <w:rPr>
+                <w:b w:val="0"/>
+                <w:i w:val="0"/>
+                <w:sz w:val="20"/>
+              </w:rPr>
+              <w:t>Gaussian, a = 50 m (seed 33)</w:t>
+            </w:r>
+          </w:p>
+        </w:tc>
+        <w:tc>
+          <w:tcPr>
+            <w:tcW w:type="dxa" w:w="1701"/>
+          </w:tcPr>
+          <w:p>
+            <w:pPr>
+              <w:spacing w:line="240" w:lineRule="auto"/>
+            </w:pPr>
+            <w:r>
+              <w:rPr>
+                <w:b w:val="0"/>
+                <w:i w:val="0"/>
+                <w:sz w:val="20"/>
+              </w:rPr>
+              <w:t>-0.59</w:t>
+            </w:r>
+          </w:p>
+        </w:tc>
+        <w:tc>
+          <w:tcPr>
+            <w:tcW w:type="dxa" w:w="1701"/>
+          </w:tcPr>
+          <w:p>
+            <w:pPr>
+              <w:spacing w:line="240" w:lineRule="auto"/>
+            </w:pPr>
+            <w:r>
+              <w:rPr>
+                <w:b w:val="0"/>
+                <w:i w:val="0"/>
+                <w:sz w:val="20"/>
+              </w:rPr>
+              <w:t>-0.67</w:t>
+            </w:r>
+          </w:p>
+        </w:tc>
+        <w:tc>
+          <w:tcPr>
+            <w:tcW w:type="dxa" w:w="1701"/>
+          </w:tcPr>
+          <w:p>
+            <w:pPr>
+              <w:spacing w:line="240" w:lineRule="auto"/>
+            </w:pPr>
+            <w:r>
+              <w:rPr>
+                <w:b w:val="0"/>
+                <w:i w:val="0"/>
+                <w:sz w:val="20"/>
+              </w:rPr>
+              <w:t>-0.08</w:t>
+            </w:r>
+          </w:p>
+        </w:tc>
+        <w:tc>
+          <w:tcPr>
+            <w:tcW w:type="dxa" w:w="1474"/>
+          </w:tcPr>
+          <w:p>
+            <w:pPr>
+              <w:spacing w:line="240" w:lineRule="auto"/>
+            </w:pPr>
+            <w:r>
+              <w:rPr>
+                <w:b w:val="0"/>
+                <w:i w:val="0"/>
+                <w:sz w:val="20"/>
+              </w:rPr>
+              <w:t>-3.01</w:t>
+            </w:r>
+          </w:p>
+        </w:tc>
+      </w:tr>
+      <w:tr>
+        <w:tc>
+          <w:tcPr>
+            <w:tcW w:type="dxa" w:w="2948"/>
+          </w:tcPr>
+          <w:p>
+            <w:pPr>
+              <w:spacing w:line="240" w:lineRule="auto"/>
+            </w:pPr>
+            <w:r>
+              <w:rPr>
+                <w:b w:val="0"/>
+                <w:i w:val="0"/>
+                <w:sz w:val="20"/>
+              </w:rPr>
+              <w:t>exponential, a = 5 m</w:t>
+            </w:r>
+          </w:p>
+        </w:tc>
+        <w:tc>
+          <w:tcPr>
+            <w:tcW w:type="dxa" w:w="1701"/>
+          </w:tcPr>
+          <w:p>
+            <w:pPr>
+              <w:spacing w:line="240" w:lineRule="auto"/>
+            </w:pPr>
+            <w:r>
+              <w:rPr>
+                <w:b w:val="0"/>
+                <w:i w:val="0"/>
+                <w:sz w:val="20"/>
+              </w:rPr>
+              <w:t>—</w:t>
+            </w:r>
+          </w:p>
+        </w:tc>
+        <w:tc>
+          <w:tcPr>
+            <w:tcW w:type="dxa" w:w="1701"/>
+          </w:tcPr>
+          <w:p>
+            <w:pPr>
+              <w:spacing w:line="240" w:lineRule="auto"/>
+            </w:pPr>
+            <w:r>
+              <w:rPr>
+                <w:b w:val="0"/>
+                <w:i w:val="0"/>
+                <w:sz w:val="20"/>
+              </w:rPr>
+              <w:t>-1.46</w:t>
+            </w:r>
+          </w:p>
+        </w:tc>
+        <w:tc>
+          <w:tcPr>
+            <w:tcW w:type="dxa" w:w="1701"/>
+          </w:tcPr>
+          <w:p>
+            <w:pPr>
+              <w:spacing w:line="240" w:lineRule="auto"/>
+            </w:pPr>
+            <w:r>
+              <w:rPr>
+                <w:b w:val="0"/>
+                <w:i w:val="0"/>
+                <w:sz w:val="20"/>
+              </w:rPr>
+              <w:t>—</w:t>
+            </w:r>
+          </w:p>
+        </w:tc>
+        <w:tc>
+          <w:tcPr>
+            <w:tcW w:type="dxa" w:w="1474"/>
+          </w:tcPr>
+          <w:p>
+            <w:pPr>
+              <w:spacing w:line="240" w:lineRule="auto"/>
+            </w:pPr>
+            <w:r>
+              <w:rPr>
+                <w:b w:val="0"/>
+                <w:i w:val="0"/>
+                <w:sz w:val="20"/>
+              </w:rPr>
+              <w:t>-1.11</w:t>
+            </w:r>
+          </w:p>
+        </w:tc>
+      </w:tr>
+      <w:tr>
+        <w:tc>
+          <w:tcPr>
+            <w:tcW w:type="dxa" w:w="2948"/>
+          </w:tcPr>
+          <w:p>
+            <w:pPr>
+              <w:spacing w:line="240" w:lineRule="auto"/>
+            </w:pPr>
+            <w:r>
+              <w:rPr>
+                <w:b w:val="0"/>
+                <w:i w:val="0"/>
+                <w:sz w:val="20"/>
+              </w:rPr>
+              <w:t>exponential, a = 9 m</w:t>
+            </w:r>
+          </w:p>
+        </w:tc>
+        <w:tc>
+          <w:tcPr>
+            <w:tcW w:type="dxa" w:w="1701"/>
+          </w:tcPr>
+          <w:p>
+            <w:pPr>
+              <w:spacing w:line="240" w:lineRule="auto"/>
+            </w:pPr>
+            <w:r>
+              <w:rPr>
+                <w:b w:val="0"/>
+                <w:i w:val="0"/>
+                <w:sz w:val="20"/>
+              </w:rPr>
+              <w:t>-1.61</w:t>
+            </w:r>
+          </w:p>
+        </w:tc>
+        <w:tc>
+          <w:tcPr>
+            <w:tcW w:type="dxa" w:w="1701"/>
+          </w:tcPr>
+          <w:p>
+            <w:pPr>
+              <w:spacing w:line="240" w:lineRule="auto"/>
+            </w:pPr>
+            <w:r>
+              <w:rPr>
+                <w:b w:val="0"/>
+                <w:i w:val="0"/>
+                <w:sz w:val="20"/>
+              </w:rPr>
+              <w:t>-1.26</w:t>
+            </w:r>
+          </w:p>
+        </w:tc>
+        <w:tc>
+          <w:tcPr>
+            <w:tcW w:type="dxa" w:w="1701"/>
+          </w:tcPr>
+          <w:p>
+            <w:pPr>
+              <w:spacing w:line="240" w:lineRule="auto"/>
+            </w:pPr>
+            <w:r>
+              <w:rPr>
+                <w:b w:val="0"/>
+                <w:i w:val="0"/>
+                <w:sz w:val="20"/>
+              </w:rPr>
+              <w:t>+0.35</w:t>
+            </w:r>
+          </w:p>
+        </w:tc>
+        <w:tc>
+          <w:tcPr>
+            <w:tcW w:type="dxa" w:w="1474"/>
+          </w:tcPr>
+          <w:p>
+            <w:pPr>
+              <w:spacing w:line="240" w:lineRule="auto"/>
+            </w:pPr>
+            <w:r>
+              <w:rPr>
+                <w:b w:val="0"/>
+                <w:i w:val="0"/>
+                <w:sz w:val="20"/>
+              </w:rPr>
+              <w:t>-1.03</w:t>
+            </w:r>
+          </w:p>
+        </w:tc>
+      </w:tr>
+      <w:tr>
+        <w:tc>
+          <w:tcPr>
+            <w:tcW w:type="dxa" w:w="2948"/>
+          </w:tcPr>
+          <w:p>
+            <w:pPr>
+              <w:spacing w:line="240" w:lineRule="auto"/>
+            </w:pPr>
+            <w:r>
+              <w:rPr>
+                <w:b w:val="0"/>
+                <w:i w:val="0"/>
+                <w:sz w:val="20"/>
+              </w:rPr>
+              <w:t>exponential, a = 17 m</w:t>
+            </w:r>
+          </w:p>
+        </w:tc>
+        <w:tc>
+          <w:tcPr>
+            <w:tcW w:type="dxa" w:w="1701"/>
+          </w:tcPr>
+          <w:p>
+            <w:pPr>
+              <w:spacing w:line="240" w:lineRule="auto"/>
+            </w:pPr>
+            <w:r>
+              <w:rPr>
+                <w:b w:val="0"/>
+                <w:i w:val="0"/>
+                <w:sz w:val="20"/>
+              </w:rPr>
+              <w:t>-1.41</w:t>
+            </w:r>
+          </w:p>
+        </w:tc>
+        <w:tc>
+          <w:tcPr>
+            <w:tcW w:type="dxa" w:w="1701"/>
+          </w:tcPr>
+          <w:p>
+            <w:pPr>
+              <w:spacing w:line="240" w:lineRule="auto"/>
+            </w:pPr>
+            <w:r>
+              <w:rPr>
+                <w:b w:val="0"/>
+                <w:i w:val="0"/>
+                <w:sz w:val="20"/>
+              </w:rPr>
+              <w:t>-1.02</w:t>
+            </w:r>
+          </w:p>
+        </w:tc>
+        <w:tc>
+          <w:tcPr>
+            <w:tcW w:type="dxa" w:w="1701"/>
+          </w:tcPr>
+          <w:p>
+            <w:pPr>
+              <w:spacing w:line="240" w:lineRule="auto"/>
+            </w:pPr>
+            <w:r>
+              <w:rPr>
+                <w:b w:val="0"/>
+                <w:i w:val="0"/>
+                <w:sz w:val="20"/>
+              </w:rPr>
+              <w:t>+0.40</w:t>
+            </w:r>
+          </w:p>
+        </w:tc>
+        <w:tc>
+          <w:tcPr>
+            <w:tcW w:type="dxa" w:w="1474"/>
+          </w:tcPr>
+          <w:p>
+            <w:pPr>
+              <w:spacing w:line="240" w:lineRule="auto"/>
+            </w:pPr>
+            <w:r>
+              <w:rPr>
+                <w:b w:val="0"/>
+                <w:i w:val="0"/>
+                <w:sz w:val="20"/>
+              </w:rPr>
+              <w:t>-1.10</w:t>
+            </w:r>
+          </w:p>
+        </w:tc>
+      </w:tr>
+      <w:tr>
+        <w:tc>
+          <w:tcPr>
+            <w:tcW w:type="dxa" w:w="2948"/>
+          </w:tcPr>
+          <w:p>
+            <w:pPr>
+              <w:spacing w:line="240" w:lineRule="auto"/>
+            </w:pPr>
+            <w:r>
+              <w:rPr>
+                <w:b w:val="0"/>
+                <w:i w:val="0"/>
+                <w:sz w:val="20"/>
+              </w:rPr>
+              <w:t>exponential, a = 34 m</w:t>
+            </w:r>
+          </w:p>
+        </w:tc>
+        <w:tc>
+          <w:tcPr>
+            <w:tcW w:type="dxa" w:w="1701"/>
+          </w:tcPr>
+          <w:p>
+            <w:pPr>
+              <w:spacing w:line="240" w:lineRule="auto"/>
+            </w:pPr>
+            <w:r>
+              <w:rPr>
+                <w:b w:val="0"/>
+                <w:i w:val="0"/>
+                <w:sz w:val="20"/>
+              </w:rPr>
+              <w:t>-1.22</w:t>
+            </w:r>
+          </w:p>
+        </w:tc>
+        <w:tc>
+          <w:tcPr>
+            <w:tcW w:type="dxa" w:w="1701"/>
+          </w:tcPr>
+          <w:p>
+            <w:pPr>
+              <w:spacing w:line="240" w:lineRule="auto"/>
+            </w:pPr>
+            <w:r>
+              <w:rPr>
+                <w:b w:val="0"/>
+                <w:i w:val="0"/>
+                <w:sz w:val="20"/>
+              </w:rPr>
+              <w:t>-1.00</w:t>
+            </w:r>
+          </w:p>
+        </w:tc>
+        <w:tc>
+          <w:tcPr>
+            <w:tcW w:type="dxa" w:w="1701"/>
+          </w:tcPr>
+          <w:p>
+            <w:pPr>
+              <w:spacing w:line="240" w:lineRule="auto"/>
+            </w:pPr>
+            <w:r>
+              <w:rPr>
+                <w:b w:val="0"/>
+                <w:i w:val="0"/>
+                <w:sz w:val="20"/>
+              </w:rPr>
+              <w:t>+0.22</w:t>
+            </w:r>
+          </w:p>
+        </w:tc>
+        <w:tc>
+          <w:tcPr>
+            <w:tcW w:type="dxa" w:w="1474"/>
+          </w:tcPr>
+          <w:p>
+            <w:pPr>
+              <w:spacing w:line="240" w:lineRule="auto"/>
+            </w:pPr>
+            <w:r>
+              <w:rPr>
+                <w:b w:val="0"/>
+                <w:i w:val="0"/>
+                <w:sz w:val="20"/>
+              </w:rPr>
+              <w:t>-1.22</w:t>
+            </w:r>
+          </w:p>
+        </w:tc>
+      </w:tr>
+      <w:tr>
+        <w:tc>
+          <w:tcPr>
+            <w:tcW w:type="dxa" w:w="2948"/>
+          </w:tcPr>
+          <w:p>
+            <w:pPr>
+              <w:spacing w:line="240" w:lineRule="auto"/>
+            </w:pPr>
+            <w:r>
+              <w:rPr>
+                <w:b w:val="0"/>
+                <w:i w:val="0"/>
+                <w:sz w:val="20"/>
+              </w:rPr>
+              <w:t>exponential, a = 67 m</w:t>
+            </w:r>
+          </w:p>
+        </w:tc>
+        <w:tc>
+          <w:tcPr>
+            <w:tcW w:type="dxa" w:w="1701"/>
+          </w:tcPr>
+          <w:p>
+            <w:pPr>
+              <w:spacing w:line="240" w:lineRule="auto"/>
+            </w:pPr>
+            <w:r>
+              <w:rPr>
+                <w:b w:val="0"/>
+                <w:i w:val="0"/>
+                <w:sz w:val="20"/>
+              </w:rPr>
+              <w:t>-1.40</w:t>
+            </w:r>
+          </w:p>
+        </w:tc>
+        <w:tc>
+          <w:tcPr>
+            <w:tcW w:type="dxa" w:w="1701"/>
+          </w:tcPr>
+          <w:p>
+            <w:pPr>
+              <w:spacing w:line="240" w:lineRule="auto"/>
+            </w:pPr>
+            <w:r>
+              <w:rPr>
+                <w:b w:val="0"/>
+                <w:i w:val="0"/>
+                <w:sz w:val="20"/>
+              </w:rPr>
+              <w:t>-1.01</w:t>
+            </w:r>
+          </w:p>
+        </w:tc>
+        <w:tc>
+          <w:tcPr>
+            <w:tcW w:type="dxa" w:w="1701"/>
+          </w:tcPr>
+          <w:p>
+            <w:pPr>
+              <w:spacing w:line="240" w:lineRule="auto"/>
+            </w:pPr>
+            <w:r>
+              <w:rPr>
+                <w:b w:val="0"/>
+                <w:i w:val="0"/>
+                <w:sz w:val="20"/>
+              </w:rPr>
+              <w:t>+0.39</w:t>
+            </w:r>
+          </w:p>
+        </w:tc>
+        <w:tc>
+          <w:tcPr>
+            <w:tcW w:type="dxa" w:w="1474"/>
+          </w:tcPr>
+          <w:p>
+            <w:pPr>
+              <w:spacing w:line="240" w:lineRule="auto"/>
+            </w:pPr>
+            <w:r>
+              <w:rPr>
+                <w:b w:val="0"/>
+                <w:i w:val="0"/>
+                <w:sz w:val="20"/>
+              </w:rPr>
+              <w:t>-1.52</w:t>
+            </w:r>
+          </w:p>
+        </w:tc>
+      </w:tr>
+      <w:tr>
+        <w:tc>
+          <w:tcPr>
+            <w:tcW w:type="dxa" w:w="2948"/>
+          </w:tcPr>
+          <w:p>
+            <w:pPr>
+              <w:spacing w:line="240" w:lineRule="auto"/>
+            </w:pPr>
+            <w:r>
+              <w:rPr>
+                <w:b w:val="0"/>
+                <w:i w:val="0"/>
+                <w:sz w:val="20"/>
+              </w:rPr>
+              <w:t>exponential, a = 134 m</w:t>
+            </w:r>
+          </w:p>
+        </w:tc>
+        <w:tc>
+          <w:tcPr>
+            <w:tcW w:type="dxa" w:w="1701"/>
+          </w:tcPr>
+          <w:p>
+            <w:pPr>
+              <w:spacing w:line="240" w:lineRule="auto"/>
+            </w:pPr>
+            <w:r>
+              <w:rPr>
+                <w:b w:val="0"/>
+                <w:i w:val="0"/>
+                <w:sz w:val="20"/>
+              </w:rPr>
+              <w:t>-1.30</w:t>
+            </w:r>
+          </w:p>
+        </w:tc>
+        <w:tc>
+          <w:tcPr>
+            <w:tcW w:type="dxa" w:w="1701"/>
+          </w:tcPr>
+          <w:p>
+            <w:pPr>
+              <w:spacing w:line="240" w:lineRule="auto"/>
+            </w:pPr>
+            <w:r>
+              <w:rPr>
+                <w:b w:val="0"/>
+                <w:i w:val="0"/>
+                <w:sz w:val="20"/>
+              </w:rPr>
+              <w:t>-0.99</w:t>
+            </w:r>
+          </w:p>
+        </w:tc>
+        <w:tc>
+          <w:tcPr>
+            <w:tcW w:type="dxa" w:w="1701"/>
+          </w:tcPr>
+          <w:p>
+            <w:pPr>
+              <w:spacing w:line="240" w:lineRule="auto"/>
+            </w:pPr>
+            <w:r>
+              <w:rPr>
+                <w:b w:val="0"/>
+                <w:i w:val="0"/>
+                <w:sz w:val="20"/>
+              </w:rPr>
+              <w:t>+0.31</w:t>
+            </w:r>
+          </w:p>
+        </w:tc>
+        <w:tc>
+          <w:tcPr>
+            <w:tcW w:type="dxa" w:w="1474"/>
+          </w:tcPr>
+          <w:p>
+            <w:pPr>
+              <w:spacing w:line="240" w:lineRule="auto"/>
+            </w:pPr>
+            <w:r>
+              <w:rPr>
+                <w:b w:val="0"/>
+                <w:i w:val="0"/>
+                <w:sz w:val="20"/>
+              </w:rPr>
+              <w:t>-1.82</w:t>
+            </w:r>
+          </w:p>
+        </w:tc>
+      </w:tr>
+      <w:tr>
+        <w:tc>
+          <w:tcPr>
+            <w:tcW w:type="dxa" w:w="2948"/>
+          </w:tcPr>
+          <w:p>
+            <w:pPr>
+              <w:spacing w:line="240" w:lineRule="auto"/>
+            </w:pPr>
+            <w:r>
+              <w:rPr>
+                <w:b w:val="0"/>
+                <w:i w:val="0"/>
+                <w:sz w:val="20"/>
+              </w:rPr>
+              <w:t>FORGE data</w:t>
+            </w:r>
+          </w:p>
+        </w:tc>
+        <w:tc>
+          <w:tcPr>
+            <w:tcW w:type="dxa" w:w="1701"/>
+          </w:tcPr>
+          <w:p>
+            <w:pPr>
+              <w:spacing w:line="240" w:lineRule="auto"/>
+            </w:pPr>
+            <w:r>
+              <w:rPr>
+                <w:b w:val="0"/>
+                <w:i w:val="0"/>
+                <w:sz w:val="20"/>
+              </w:rPr>
+              <w:t>-1.46 [-1.59, -1.27]</w:t>
+            </w:r>
+          </w:p>
+        </w:tc>
+        <w:tc>
+          <w:tcPr>
+            <w:tcW w:type="dxa" w:w="1701"/>
+          </w:tcPr>
+          <w:p>
+            <w:pPr>
+              <w:spacing w:line="240" w:lineRule="auto"/>
+            </w:pPr>
+            <w:r>
+              <w:rPr>
+                <w:b w:val="0"/>
+                <w:i w:val="0"/>
+                <w:sz w:val="20"/>
+              </w:rPr>
+              <w:t>-1.50 [-1.70, -1.18]</w:t>
+            </w:r>
+          </w:p>
+        </w:tc>
+        <w:tc>
+          <w:tcPr>
+            <w:tcW w:type="dxa" w:w="1701"/>
+          </w:tcPr>
+          <w:p>
+            <w:pPr>
+              <w:spacing w:line="240" w:lineRule="auto"/>
+            </w:pPr>
+            <w:r>
+              <w:rPr>
+                <w:b w:val="0"/>
+                <w:i w:val="0"/>
+                <w:sz w:val="20"/>
+              </w:rPr>
+              <w:t>-0.04 [-0.31, +0.29]</w:t>
+            </w:r>
+          </w:p>
+        </w:tc>
+        <w:tc>
+          <w:tcPr>
+            <w:tcW w:type="dxa" w:w="1474"/>
+          </w:tcPr>
+          <w:p>
+            <w:pPr>
+              <w:spacing w:line="240" w:lineRule="auto"/>
+            </w:pPr>
+            <w:r>
+              <w:rPr>
+                <w:b w:val="0"/>
+                <w:i w:val="0"/>
+                <w:sz w:val="20"/>
+              </w:rPr>
+              <w:t>-1.58</w:t>
+            </w:r>
+          </w:p>
+        </w:tc>
+      </w:tr>
+    </w:tbl>
+    <w:p>
+      <w:pPr>
+        <w:jc w:val="both"/>
+      </w:pPr>
+      <w:r>
+        <w:rPr>
+          <w:b w:val="0"/>
+          <w:i w:val="0"/>
+          <w:sz w:val="20"/>
+        </w:rPr>
+        <w:t>Slopes are log</w:t>
+      </w:r>
+      <w:r>
+        <w:rPr>
+          <w:b w:val="0"/>
+          <w:i w:val="0"/>
+          <w:sz w:val="20"/>
+          <w:vertAlign w:val="subscript"/>
+        </w:rPr>
+        <w:t>2</w:t>
+      </w:r>
+      <w:r>
+        <w:rPr>
+          <w:b w:val="0"/>
+          <w:i w:val="0"/>
+          <w:sz w:val="20"/>
+        </w:rPr>
+        <w:t xml:space="preserve"> ratios of median Q</w:t>
+      </w:r>
+      <w:r>
+        <w:rPr>
+          <w:b w:val="0"/>
+          <w:i w:val="0"/>
+          <w:sz w:val="20"/>
+          <w:vertAlign w:val="subscript"/>
+        </w:rPr>
+        <w:t>c</w:t>
+      </w:r>
+      <w:r>
+        <w:rPr>
+          <w:b w:val="0"/>
+          <w:i w:val="0"/>
+          <w:sz w:val="20"/>
+          <w:vertAlign w:val="superscript"/>
+        </w:rPr>
+        <w:t>-1</w:t>
+      </w:r>
+      <w:r>
+        <w:rPr>
+          <w:b w:val="0"/>
+          <w:i w:val="0"/>
+          <w:sz w:val="20"/>
+        </w:rPr>
+        <w:t xml:space="preserve"> between octave bands; curvature = slope(50–100) − slope(25–50). Brackets: 95 % bootstrap intervals over events. Coda level = log</w:t>
+      </w:r>
+      <w:r>
+        <w:rPr>
+          <w:b w:val="0"/>
+          <w:i w:val="0"/>
+          <w:sz w:val="20"/>
+          <w:vertAlign w:val="subscript"/>
+        </w:rPr>
+        <w:t>10</w:t>
+      </w:r>
+      <w:r>
+        <w:rPr>
+          <w:b w:val="0"/>
+          <w:i w:val="0"/>
+          <w:sz w:val="20"/>
+        </w:rPr>
+        <w:t>(E</w:t>
+      </w:r>
+      <w:r>
+        <w:rPr>
+          <w:b w:val="0"/>
+          <w:i w:val="0"/>
+          <w:sz w:val="20"/>
+          <w:vertAlign w:val="subscript"/>
+        </w:rPr>
+        <w:t>coda</w:t>
+      </w:r>
+      <w:r>
+        <w:rPr>
+          <w:b w:val="0"/>
+          <w:i w:val="0"/>
+          <w:sz w:val="20"/>
+        </w:rPr>
+        <w:t>/E</w:t>
+      </w:r>
+      <w:r>
+        <w:rPr>
+          <w:b w:val="0"/>
+          <w:i w:val="0"/>
+          <w:sz w:val="20"/>
+          <w:vertAlign w:val="subscript"/>
+        </w:rPr>
+        <w:t>S</w:t>
+      </w:r>
+      <w:r>
+        <w:rPr>
+          <w:b w:val="0"/>
+          <w:i w:val="0"/>
+          <w:sz w:val="20"/>
+        </w:rPr>
+        <w:t>) at 100 Hz. The 25–50 Hz slope uses the 5-m grid, the 50–100 Hz slope and 100-Hz level the 2.5-m grid; a = 5 m is not resolved on the 5-m grid.</w:t>
+      </w:r>
+    </w:p>
+    <w:p>
+      <w:pPr>
+        <w:jc w:val="both"/>
+      </w:pPr>
+      <w:r>
+        <w:rPr>
+          <w:b w:val="0"/>
+          <w:i w:val="0"/>
+        </w:rPr>
+        <w:t>Table 5 and Fig. 17 give the results of the correlation-length series. The Q</w:t>
+      </w:r>
+      <w:r>
+        <w:rPr>
+          <w:b w:val="0"/>
+          <w:i w:val="0"/>
+          <w:vertAlign w:val="subscript"/>
+        </w:rPr>
+        <w:t>c</w:t>
+      </w:r>
+      <w:r>
+        <w:rPr>
+          <w:b w:val="0"/>
+          <w:i w:val="0"/>
+          <w:vertAlign w:val="superscript"/>
+        </w:rPr>
+        <w:t>-1</w:t>
+      </w:r>
+      <w:r>
+        <w:rPr>
+          <w:b w:val="0"/>
+          <w:i w:val="0"/>
+        </w:rPr>
+        <w:t xml:space="preserve"> curvature does not identify a correlation length. The simulated media, including the pink, Gaussian and homogeneous crusts, give curvatures of -0.08 to +0.49, positive in all but one, with no systematic dependence on </w:t>
+      </w:r>
+      <w:r>
+        <w:rPr>
+          <w:b w:val="0"/>
+          <w:i/>
+        </w:rPr>
+        <w:t>a</w:t>
+      </w:r>
+      <w:r>
+        <w:rPr>
+          <w:b w:val="0"/>
+          <w:i w:val="0"/>
+        </w:rPr>
+        <w:t>, while FORGE gives -0.04 [-0.31, +0.29]. The single power law of the observed Q</w:t>
+      </w:r>
+      <w:r>
+        <w:rPr>
+          <w:b w:val="0"/>
+          <w:i w:val="0"/>
+          <w:vertAlign w:val="subscript"/>
+        </w:rPr>
+        <w:t>c</w:t>
+      </w:r>
+      <w:r>
+        <w:rPr>
+          <w:b w:val="0"/>
+          <w:i w:val="0"/>
+          <w:vertAlign w:val="superscript"/>
+        </w:rPr>
+        <w:t>-1</w:t>
+      </w:r>
+      <w:r>
+        <w:rPr>
+          <w:b w:val="0"/>
+          <w:i w:val="0"/>
+        </w:rPr>
+        <w:t xml:space="preserve"> is therefore not evidence for scale-free heterogeneity. The common positive curvature of the models probably reflects the short coda window in the 25-Hz band rather than the medium. The coda level at 100 Hz is far more selective. It falls steadily with correlation length in the exponential series (-1.03 for </w:t>
+      </w:r>
+      <w:r>
+        <w:rPr>
+          <w:b w:val="0"/>
+          <w:i/>
+        </w:rPr>
+        <w:t>a</w:t>
+      </w:r>
+      <w:r>
+        <w:rPr>
+          <w:b w:val="0"/>
+          <w:i w:val="0"/>
+        </w:rPr>
+        <w:t xml:space="preserve"> = 9 m to -1.82 for </w:t>
+      </w:r>
+      <w:r>
+        <w:rPr>
+          <w:b w:val="0"/>
+          <w:i/>
+        </w:rPr>
+        <w:t>a</w:t>
+      </w:r>
+      <w:r>
+        <w:rPr>
+          <w:b w:val="0"/>
+          <w:i w:val="0"/>
+        </w:rPr>
+        <w:t xml:space="preserve"> = 134 m), because large-</w:t>
+      </w:r>
+      <w:r>
+        <w:rPr>
+          <w:b w:val="0"/>
+          <w:i/>
+        </w:rPr>
+        <w:t>a</w:t>
+      </w:r>
+      <w:r>
+        <w:rPr>
+          <w:b w:val="0"/>
+          <w:i w:val="0"/>
+        </w:rPr>
+        <w:t xml:space="preserve"> media lack the small-scale structure that scatters 30-m wavelengths. The Gaussian media with </w:t>
+      </w:r>
+      <w:r>
+        <w:rPr>
+          <w:b w:val="0"/>
+          <w:i/>
+        </w:rPr>
+        <w:t>a</w:t>
+      </w:r>
+      <w:r>
+        <w:rPr>
+          <w:b w:val="0"/>
+          <w:i w:val="0"/>
+        </w:rPr>
+        <w:t xml:space="preserve"> = 50 m (-2.20, -3.01) and the homogeneous crust (-3.17) fall 0.6–1.6 log units below FORGE (-1.58). The pink realisations (-1.20, -1.50) and the exponential media with </w:t>
+      </w:r>
+      <w:r>
+        <w:rPr>
+          <w:b w:val="0"/>
+          <w:i/>
+        </w:rPr>
+        <w:t>a</w:t>
+      </w:r>
+      <w:r>
+        <w:rPr>
+          <w:b w:val="0"/>
+          <w:i w:val="0"/>
+        </w:rPr>
+        <w:t xml:space="preserve"> ≳ 30 m lie within about 0.4. The Gaussian medium that matched the 20–80 Hz coda statistics as well as pink noise is thus rejected once the analysis reaches 100 Hz. The observed 50–100 Hz slope (-1.50) is steeper than in every simulated medium except the smallest-scale exponential ones (</w:t>
+      </w:r>
+      <w:r>
+        <w:rPr>
+          <w:b w:val="0"/>
+          <w:i/>
+        </w:rPr>
+        <w:t>a</w:t>
+      </w:r>
+      <w:r>
+        <w:rPr>
+          <w:b w:val="0"/>
+          <w:i w:val="0"/>
+        </w:rPr>
+        <w:t xml:space="preserve"> = 5 and 9 m: -1.46, -1.26); the pink realisations (-1.18, -1.20) lie at the edge of its interval. Among the simulated media, only pink noise comes close to both the 100-Hz coda level and the 50–100 Hz slope. Media rich in very small scales match the slope but give too much 100-Hz coda at σ = 0.13, and media with large </w:t>
+      </w:r>
+      <w:r>
+        <w:rPr>
+          <w:b w:val="0"/>
+          <w:i/>
+        </w:rPr>
+        <w:t>a</w:t>
+      </w:r>
+      <w:r>
+        <w:rPr>
+          <w:b w:val="0"/>
+          <w:i w:val="0"/>
+        </w:rPr>
+        <w:t xml:space="preserve"> match the level but not the slope. With one realisation per correlation length and σ fixed, this is suggestive rather than decisive.</w:t>
+      </w:r>
+    </w:p>
+    <w:p>
+      <w:r>
+        <w:rPr>
+          <w:b/>
+        </w:rPr>
+        <w:t xml:space="preserve">Fig. 17 </w:t>
+      </w:r>
+      <w:r>
+        <w:rPr>
+          <w:b/>
+          <w:i w:val="0"/>
+        </w:rPr>
+        <w:t>Q</w:t>
+      </w:r>
+      <w:r>
+        <w:rPr>
+          <w:b/>
+          <w:i w:val="0"/>
+          <w:vertAlign w:val="subscript"/>
+        </w:rPr>
+        <w:t>c</w:t>
+      </w:r>
+      <w:r>
+        <w:rPr>
+          <w:b/>
+          <w:i w:val="0"/>
+          <w:vertAlign w:val="superscript"/>
+        </w:rPr>
+        <w:t>-1</w:t>
+      </w:r>
+      <w:r>
+        <w:rPr>
+          <w:b/>
+          <w:i w:val="0"/>
+        </w:rPr>
+        <w:t xml:space="preserve"> frequency dependence and 100-Hz coda level versus correlation length</w:t>
+      </w:r>
+    </w:p>
+    <w:p>
+      <w:pPr>
+        <w:jc w:val="both"/>
+      </w:pPr>
+      <w:r>
+        <w:rPr>
+          <w:b w:val="0"/>
+          <w:i w:val="0"/>
+        </w:rPr>
+        <w:t>a) Q</w:t>
+      </w:r>
+      <w:r>
+        <w:rPr>
+          <w:b w:val="0"/>
+          <w:i w:val="0"/>
+          <w:vertAlign w:val="subscript"/>
+        </w:rPr>
+        <w:t>c</w:t>
+      </w:r>
+      <w:r>
+        <w:rPr>
+          <w:b w:val="0"/>
+          <w:i w:val="0"/>
+          <w:vertAlign w:val="superscript"/>
+        </w:rPr>
+        <w:t>-1</w:t>
+      </w:r>
+      <w:r>
+        <w:rPr>
+          <w:b w:val="0"/>
+          <w:i w:val="0"/>
+        </w:rPr>
+        <w:t xml:space="preserve"> normalised at 50 Hz, from the 25–50 Hz slope (sensor A, 5-m grid, circles) and the 50–100 Hz slope (sensor B, 2.5-m grid, squares); black: FORGE; blue: exponential series (darker = larger </w:t>
+      </w:r>
+      <w:r>
+        <w:rPr>
+          <w:b w:val="0"/>
+          <w:i/>
+        </w:rPr>
+        <w:t>a</w:t>
+      </w:r>
+      <w:r>
+        <w:rPr>
+          <w:b w:val="0"/>
+          <w:i w:val="0"/>
+        </w:rPr>
+        <w:t xml:space="preserve">); orange: pink; green: Gaussian </w:t>
+      </w:r>
+      <w:r>
+        <w:rPr>
+          <w:b w:val="0"/>
+          <w:i/>
+        </w:rPr>
+        <w:t>a</w:t>
+      </w:r>
+      <w:r>
+        <w:rPr>
+          <w:b w:val="0"/>
+          <w:i w:val="0"/>
+        </w:rPr>
+        <w:t xml:space="preserve"> = 50 m; grey: homogeneous. b) Curvature, slope(50–100 Hz) − slope(25–50 Hz), versus correlation length; black line and grey band: FORGE with 95 % bootstrap interval; pink (orange) and homogeneous (grey) media are plotted at the right and left edges. c) Coda level at 100 Hz (sensor B) versus correlation length; black line: FORGE; symbols as in b).</w:t>
+      </w:r>
+    </w:p>
+    <w:p>
+      <w:pPr>
         <w:pStyle w:val="Heading1"/>
       </w:pPr>
       <w:r>
@@ -8352,7 +10338,7 @@
           <w:b w:val="0"/>
           <w:i w:val="0"/>
         </w:rPr>
-        <w:t>Three results should be kept apart. First, every smooth crust (homogeneous, layered, VTI) fails, on three independent observables. It under-predicts the observed S coda by more than an order of magnitude, event by event; it keeps the coda of neighbouring events coherent where the data decorrelate; and it fails the statistical test. VTI anisotropy changes the direct waves but creates neither coda nor decorrelation. Second, the coda requires strong heterogeneity (σ of roughly 0.1–0.2 at 5-m scale) but does not establish its spectral shape. In repeated truth tests the wavefield separates small-scale-rich media from Gaussian media reliably, but cannot separate pink from exponential media, which are nearly the same field over 10–700 m. On FORGE, with two realisations per family, it prefers no family in the coda statistics. The frequency slope of Q</w:t>
+        <w:t>Three results should be kept apart. First, every smooth crust (homogeneous, layered, VTI) fails, on three independent observables. It under-predicts the observed S coda by more than an order of magnitude, event by event; it keeps the coda of neighbouring events coherent where the data decorrelate; and it fails the statistical test. VTI anisotropy changes the direct waves but creates neither coda nor decorrelation. Second, the coda requires strong heterogeneity (σ of roughly 0.1–0.2 at 5-m scale) but does not establish its spectral shape. In repeated truth tests the wavefield separates small-scale-rich media from Gaussian media reliably, but cannot separate pink from exponential media, which are nearly the same field over 10–700 m. On FORGE, with two realisations per family, it prefers no family in the 20–80 Hz coda statistics. Higher frequencies are more selective. The 25–50 Hz Q</w:t>
       </w:r>
       <w:r>
         <w:rPr>
@@ -8375,7 +10361,7 @@
           <w:b w:val="0"/>
           <w:i w:val="0"/>
         </w:rPr>
-        <w:t xml:space="preserve"> between 25 and 50 Hz is more selective: it matches pink and exponential media and excludes smooth crusts and, in most realisations, the large-scale Gaussian medium. Third, the borehole data supply the shape. The sonic log is scale-free over 12–200 m, which is consistent with pink noise, marginally with an exponential medium and not with a Gaussian one. The two lines of evidence are complementary rather than in conflict: the seismic data fix the strength of heterogeneity in the stimulated volume, and the log fixes its scaling in the intact rock. Taken together they support a strongly scattering crust with power-law heterogeneity, as assumed in GFI. The MEQ wavefield alone is not independent proof of the pink 1/</w:t>
+        <w:t xml:space="preserve"> slope excludes smooth crusts and most large-scale Gaussian realisations, and the 100-Hz coda level rejects the large-scale Gaussian medium outright while matching pink noise. Third, the borehole data supply the shape. The sonic log is scale-free over 12–200 m, which is consistent with pink noise, marginally with an exponential medium and not with a Gaussian one. The two lines of evidence are complementary rather than in conflict: the seismic data fix the strength of heterogeneity in the stimulated volume, and the log fixes its scaling in the intact rock. Taken together they support a strongly scattering crust with power-law heterogeneity, as assumed in GFI. The MEQ wavefield alone is not independent proof of the pink 1/</w:t>
       </w:r>
       <w:r>
         <w:rPr>
@@ -8409,7 +10395,7 @@
           <w:b w:val="0"/>
           <w:i w:val="0"/>
         </w:rPr>
-        <w:t>That coda waves are scattered by crustal heterogeneity is long established [7,9], and power-law heterogeneity spectra have been inferred from well logs [1,3]. What has remained open is which heterogeneity produces the coda of a given reservoir. Stochastic models are often chosen for convenience and fitted with a free correlation length. The FORGE data allow a more specific answer at the reservoir scale. The heterogeneity must be strong (σ ≈ 0.1–0.2 at 5-m scale) and rich in small scales (≲ 15 m). Its coda attenuation shows no characteristic frequency over S wavelengths of about 17–134 m (Q</w:t>
+        <w:t>That coda waves are scattered by crustal heterogeneity is long established [7,9], and power-law heterogeneity spectra have been inferred from well logs [1,3]. What has remained open is which heterogeneity produces the coda of a given reservoir. Stochastic models are often chosen for convenience and fitted with a free correlation length. The FORGE data allow a more specific answer at the reservoir scale. The heterogeneity must be strong (σ ≈ 0.1–0.2 at 5-m scale), and it must retain enough small-scale structure to sustain the coda at 100 Hz. That requirement rejects the smooth crusts and the large-scale Gaussian medium. Of the media tested, pink noise alone comes close to both the 100-Hz coda level and the 50–100 Hz Q</w:t>
       </w:r>
       <w:r>
         <w:rPr>
@@ -8432,7 +10418,30 @@
           <w:b w:val="0"/>
           <w:i w:val="0"/>
         </w:rPr>
-        <w:t xml:space="preserve"> as a single power law over 25–200 Hz), as expected for a scale-free medium. The borehole data, in turn, show a scale-free spectrum over 12–200 m. A lognormal pink-noise field, the same statistical object that describes poro-permeability in the GFI framework, is consistent with all of these observations. If this holds more widely, the coda is not a nuisance tail but a direct observable of the flow-controlling heterogeneity. This link can be tested only with broadband near-source records such as those at FORGE. At 200 samples/s the band above 100 Hz, which carries most of the S-wave energy of these events, is not recorded at all. The present data do not, however, exclude an exponential medium, which differs from pink noise mainly below 10 m.</w:t>
+        <w:t xml:space="preserve"> slope. The single power law of Q</w:t>
+      </w:r>
+      <w:r>
+        <w:rPr>
+          <w:b w:val="0"/>
+          <w:i w:val="0"/>
+          <w:vertAlign w:val="subscript"/>
+        </w:rPr>
+        <w:t>c</w:t>
+      </w:r>
+      <w:r>
+        <w:rPr>
+          <w:b w:val="0"/>
+          <w:i w:val="0"/>
+          <w:vertAlign w:val="superscript"/>
+        </w:rPr>
+        <w:t>-1</w:t>
+      </w:r>
+      <w:r>
+        <w:rPr>
+          <w:b w:val="0"/>
+          <w:i w:val="0"/>
+        </w:rPr>
+        <w:t xml:space="preserve"> over 25–200 Hz is not, by itself, evidence of scale-free heterogeneity, because media with correlation lengths of 9–134 m reproduce it equally well in our simulations. The borehole data show a scale-free spectrum over 12–200 m. A lognormal pink-noise field, the same statistical object that describes poro-permeability in the GFI framework, is consistent with all of these observations. If this holds more widely, the coda is not a nuisance tail but a direct observable of the flow-controlling heterogeneity. This link can be tested only with broadband near-source records such as those at FORGE. At 200 samples/s the band above 100 Hz, which carries most of the S-wave energy of these events, is not recorded at all. Our own results show why the band matters: at 20–80 Hz a Gaussian medium fits the coda as well as pink noise, and it fails only at 100 Hz. The present data do not, however, exclude an exponential medium, which differs from pink noise mainly below 10 m.</w:t>
       </w:r>
     </w:p>
     <w:p>
@@ -8590,7 +10599,7 @@
           <w:b w:val="0"/>
           <w:i w:val="0"/>
         </w:rPr>
-        <w:t xml:space="preserve">Correlation-length competitors were simulated only at σ = 0.13 and two correlation lengths, with at most two candidate and three truth realisations per family; a full (σ, </w:t>
+        <w:t xml:space="preserve">Correlation-length competitors were simulated only at σ = 0.13, with at most two candidate and three truth realisations per family and a single realisation per correlation length in the </w:t>
       </w:r>
       <w:r>
         <w:rPr>
@@ -8604,7 +10613,35 @@
           <w:b w:val="0"/>
           <w:i w:val="0"/>
         </w:rPr>
-        <w:t>) search was not performed.</w:t>
+        <w:t xml:space="preserve"> = 5–134 m series; a full (σ, </w:t>
+      </w:r>
+      <w:r>
+        <w:rPr>
+          <w:b w:val="0"/>
+          <w:i/>
+        </w:rPr>
+        <w:t>a</w:t>
+      </w:r>
+      <w:r>
+        <w:rPr>
+          <w:b w:val="0"/>
+          <w:i w:val="0"/>
+        </w:rPr>
+        <w:t xml:space="preserve">) search was not performed, so the trade-off between σ and </w:t>
+      </w:r>
+      <w:r>
+        <w:rPr>
+          <w:b w:val="0"/>
+          <w:i/>
+        </w:rPr>
+        <w:t>a</w:t>
+      </w:r>
+      <w:r>
+        <w:rPr>
+          <w:b w:val="0"/>
+          <w:i w:val="0"/>
+        </w:rPr>
+        <w:t xml:space="preserve"> in the 100-Hz coda level is not resolved.</w:t>
       </w:r>
     </w:p>
     <w:p>
@@ -8617,15 +10654,7 @@
           <w:b w:val="0"/>
           <w:i w:val="0"/>
         </w:rPr>
-        <w:t>Catalogue hypocentres were computed by the operator with a smooth velocity model, so the travel-time residual statistics mix structure with location error.</w:t>
-      </w:r>
-    </w:p>
-    <w:p>
-      <w:pPr>
-        <w:pStyle w:val="Heading1"/>
-      </w:pPr>
-      <w:r>
-        <w:t>Conclusions</w:t>
+        <w:t>The 25–50 Hz and 50–100 Hz slopes come from different sensors and grids, and the 2.5-m-grid synthetics are noise-free.</w:t>
       </w:r>
     </w:p>
     <w:p>
@@ -8638,7 +10667,15 @@
           <w:b w:val="0"/>
           <w:i w:val="0"/>
         </w:rPr>
-        <w:t>Downhole MEQ records of the 2022 FORGE stimulation were matched to the catalogue and the 56-32 sensors self-calibrated (depths 2179 and 2522 m).</w:t>
+        <w:t>Catalogue hypocentres were computed by the operator with a smooth velocity model, so the travel-time residual statistics mix structure with location error.</w:t>
+      </w:r>
+    </w:p>
+    <w:p>
+      <w:pPr>
+        <w:pStyle w:val="Heading1"/>
+      </w:pPr>
+      <w:r>
+        <w:t>Conclusions</w:t>
       </w:r>
     </w:p>
     <w:p>
@@ -8651,7 +10688,7 @@
           <w:b w:val="0"/>
           <w:i w:val="0"/>
         </w:rPr>
-        <w:t>Reciprocity-based 3-D elastic FD gives full-waveform synthetics for hundreds of paths per model, validated to 0.995 correlation in heterogeneous VTI media.</w:t>
+        <w:t>Downhole MEQ records of the 2022 FORGE stimulation were matched to the catalogue and the 56-32 sensors self-calibrated (depths 2179 and 2522 m).</w:t>
       </w:r>
     </w:p>
     <w:p>
@@ -8664,7 +10701,7 @@
           <w:b w:val="0"/>
           <w:i w:val="0"/>
         </w:rPr>
-        <w:t>Deterministic waveform inversion favours the smoothest crust even for a pink-noise truth and cannot identify the medium class.</w:t>
+        <w:t>Reciprocity-based 3-D elastic FD gives full-waveform synthetics for hundreds of paths per model, validated to 0.995 correlation in heterogeneous VTI media.</w:t>
       </w:r>
     </w:p>
     <w:p>
@@ -8677,7 +10714,7 @@
           <w:b w:val="0"/>
           <w:i w:val="0"/>
         </w:rPr>
-        <w:t>Statistical waveform inversion recovers a pink and a layered-VTI synthetic truth without bias.</w:t>
+        <w:t>Deterministic waveform inversion favours the smoothest crust even for a pink-noise truth and cannot identify the medium class.</w:t>
       </w:r>
     </w:p>
     <w:p>
@@ -8690,7 +10727,7 @@
           <w:b w:val="0"/>
           <w:i w:val="0"/>
         </w:rPr>
-        <w:t>For FORGE, homogeneous, layered and VTI crusts under-predict the observed S coda of 150 events by a factor of about 10–30, keep the coda of neighbouring events coherent where the data decorrelate, and rank last in the statistical inversion. Smooth crustal models are rejected.</w:t>
+        <w:t>Statistical waveform inversion recovers a pink and a layered-VTI synthetic truth without bias.</w:t>
       </w:r>
     </w:p>
     <w:p>
@@ -8703,7 +10740,7 @@
           <w:b w:val="0"/>
           <w:i w:val="0"/>
         </w:rPr>
-        <w:t>The coda requires strong heterogeneity: the pink optimum is σ ≈ 0.18, bracketed by runs at σ = 0.13 and 0.25, and the per-event test gives σ ≈ 0.09–0.13. This is several times the sonic-log value, which suggests stimulation-enhanced scattering.</w:t>
+        <w:t>For FORGE, homogeneous, layered and VTI crusts under-predict the observed S coda of 150 events by a factor of about 10–30, keep the coda of neighbouring events coherent where the data decorrelate, and rank last in the statistical inversion. Smooth crustal models are rejected.</w:t>
       </w:r>
     </w:p>
     <w:p>
@@ -8716,7 +10753,7 @@
           <w:b w:val="0"/>
           <w:i w:val="0"/>
         </w:rPr>
-        <w:t>At equal σ, nine synthetic truth tests show that the wavefield separates small-scale-rich from Gaussian media (8 of 9) but not pink from exponential media (3 of 6), which are 96 % correlated on the simulated scales. The FORGE data prefer no spectral family. The scale-free 56-32 log spectrum favours pink noise and excludes Gaussian media. The seismic data establish heterogeneity strength; the pink spectral form rests on the borehole data.</w:t>
+        <w:t>The coda requires strong heterogeneity: the pink optimum is σ ≈ 0.18, bracketed by runs at σ = 0.13 and 0.25, and the per-event test gives σ ≈ 0.09–0.13. This is several times the sonic-log value, which suggests stimulation-enhanced scattering.</w:t>
       </w:r>
     </w:p>
     <w:p>
@@ -8729,6 +10766,19 @@
           <w:b w:val="0"/>
           <w:i w:val="0"/>
         </w:rPr>
+        <w:t>At equal σ, nine synthetic truth tests show that the wavefield separates small-scale-rich from Gaussian media (8 of 9) but not pink from exponential media (3 of 6), which are 96 % correlated on the simulated scales. At 20–80 Hz the FORGE data prefer no spectral family; at 100 Hz they reject the large-scale Gaussian medium. The scale-free 56-32 log spectrum favours pink noise and excludes Gaussian media. The seismic data establish heterogeneity strength; the pink spectral form rests on the borehole data.</w:t>
+      </w:r>
+    </w:p>
+    <w:p>
+      <w:pPr>
+        <w:pStyle w:val="ListBullet"/>
+        <w:jc w:val="both"/>
+      </w:pPr>
+      <w:r>
+        <w:rPr>
+          <w:b w:val="0"/>
+          <w:i w:val="0"/>
+        </w:rPr>
         <w:t>The 4-kHz records carry S-wave energy above noise to about 1.8 kHz. Over 25–200 Hz the coda attenuation follows a single power law, Q</w:t>
       </w:r>
       <w:r>
@@ -8774,7 +10824,43 @@
           <w:b w:val="0"/>
           <w:i w:val="0"/>
         </w:rPr>
-        <w:t>, with no characteristic frequency, and its 25–50 Hz slope matches pink and exponential media but not smooth or large-scale Gaussian media. Everything above 100 Hz, including the upper half of this band, is inaccessible at 200 samples/s.</w:t>
+        <w:t>. Simulations with correlation lengths of 5–134 m show that this is not diagnostic of scale-free heterogeneity.</w:t>
+      </w:r>
+    </w:p>
+    <w:p>
+      <w:pPr>
+        <w:pStyle w:val="ListBullet"/>
+        <w:jc w:val="both"/>
+      </w:pPr>
+      <w:r>
+        <w:rPr>
+          <w:b w:val="0"/>
+          <w:i w:val="0"/>
+        </w:rPr>
+        <w:t>Raising the simulated band to 100 Hz (2.5-m grid) separates the media that 20–80 Hz could not. The 100-Hz coda level rejects the large-scale Gaussian medium and the smooth crust by 0.6–1.6 log units. Pink noise comes closest to both the 100-Hz coda level and the 50–100 Hz Q</w:t>
+      </w:r>
+      <w:r>
+        <w:rPr>
+          <w:b w:val="0"/>
+          <w:i w:val="0"/>
+          <w:vertAlign w:val="subscript"/>
+        </w:rPr>
+        <w:t>c</w:t>
+      </w:r>
+      <w:r>
+        <w:rPr>
+          <w:b w:val="0"/>
+          <w:i w:val="0"/>
+          <w:vertAlign w:val="superscript"/>
+        </w:rPr>
+        <w:t>-1</w:t>
+      </w:r>
+      <w:r>
+        <w:rPr>
+          <w:b w:val="0"/>
+          <w:i w:val="0"/>
+        </w:rPr>
+        <w:t xml:space="preserve"> slope; with one realisation per medium this is suggestive rather than decisive. Everything above 100 Hz is inaccessible at 200 samples/s.</w:t>
       </w:r>
     </w:p>
     <w:p>

</xml_diff>